<commit_message>
Update Lab Page to Game Style
</commit_message>
<xml_diff>
--- a/site/public/assets/research-reflection-questionnaire-zh.docx
+++ b/site/public/assets/research-reflection-questionnaire-zh.docx
@@ -30,7 +30,7 @@
           <w:sz w:val="22"/>
           <w:szCs w:val="22"/>
         </w:rPr>
-        <w:t xml:space="preserve">王士欣實驗室 — 申請文件</w:t>
+        <w:t xml:space="preserve">王士欣研究室 — 申請文件</w:t>
       </w:r>
     </w:p>
     <w:p>
@@ -183,7 +183,7 @@
           <w:sz w:val="22"/>
           <w:szCs w:val="22"/>
         </w:rPr>
-        <w:t xml:space="preserve">1. 你目前為什麼想加入實驗室或嘗試研究？</w:t>
+        <w:t xml:space="preserve">1. 你目前為什麼想加入研究室或嘗試研究？</w:t>
       </w:r>
     </w:p>
     <w:p>
@@ -338,7 +338,7 @@
           <w:sz w:val="22"/>
           <w:szCs w:val="22"/>
         </w:rPr>
-        <w:t xml:space="preserve">6. 請選擇本實驗室一篇你感興趣的研究工作，並說說你的理解和你為什麼感興趣。</w:t>
+        <w:t xml:space="preserve">6. 請選擇本研究室一篇你感興趣的研究工作，並說說你的理解和你為什麼感興趣。</w:t>
       </w:r>
     </w:p>
     <w:p>

</xml_diff>